<commit_message>
Thêm các diagram cho uc06
</commit_message>
<xml_diff>
--- a/src/main/resources/docs/Nhom10_23110110_23110078_ChoThueBatDongSan.docx
+++ b/src/main/resources/docs/Nhom10_23110110_23110078_ChoThueBatDongSan.docx
@@ -821,21 +821,346 @@
     </w:p>
     <w:p>
       <w:pPr>
+        <w:pStyle w:val="P1"/>
+      </w:pPr>
+      <w:r>
+        <w:lastRenderedPageBreak/>
+        <w:t>I</w:t>
+      </w:r>
+      <w:r>
+        <w:t xml:space="preserve">. Phân tích thực trạng và </w:t>
+      </w:r>
+      <w:r>
+        <w:t>k</w:t>
+      </w:r>
+      <w:r>
+        <w:t>hảo</w:t>
+      </w:r>
+      <w:r>
+        <w:t xml:space="preserve"> sát các hệ thống tương tự</w:t>
+      </w:r>
+    </w:p>
+    <w:p>
+      <w:r>
+        <w:t xml:space="preserve">Trong bối cảnh chuyển đổi số ngành bất động sản, việc khảo sát các hệ thống thực tế như Danang Luxury Realty hay </w:t>
+      </w:r>
+      <w:r>
+        <w:t xml:space="preserve">Toan Huy Hoang </w:t>
+      </w:r>
+      <w:r>
+        <w:t>đóng vai trò then chốt trong việc xác định mô hình nghiệp vụ. Qua phân tích, các nền tảng này thường tập trung giải quyết ba bài toán lớn: tối ưu hóa bộ lọc tìm kiếm theo vị trí/khoảng giá, minh bạch hóa thông tin lưu trữ và kết nối người thuê với chủ nhà. Tuy nhiên, thực tế thị trường vẫn còn tồn tại nhiều vấn đề như: tình trạng tin giả, giá ảo, hoặc trải nghiệm tìm kiếm cứng nhắc chưa thực sự hiểu đúng ý định của người dùng.</w:t>
+      </w:r>
+    </w:p>
+    <w:p>
+      <w:r>
+        <w:t xml:space="preserve">Trang web của </w:t>
+      </w:r>
+      <w:r>
+        <w:t>Danang Luxury Realty</w:t>
+      </w:r>
+      <w:r>
+        <w:t xml:space="preserve">: </w:t>
+      </w:r>
+      <w:hyperlink r:id="rId6" w:history="1">
+        <w:r>
+          <w:rPr>
+            <w:rStyle w:val="Hyperlink"/>
+          </w:rPr>
+          <w:t>https://dananglu</w:t>
+        </w:r>
+        <w:r>
+          <w:rPr>
+            <w:rStyle w:val="Hyperlink"/>
+          </w:rPr>
+          <w:t>x</w:t>
+        </w:r>
+        <w:r>
+          <w:rPr>
+            <w:rStyle w:val="Hyperlink"/>
+          </w:rPr>
+          <w:t>u</w:t>
+        </w:r>
+        <w:r>
+          <w:rPr>
+            <w:rStyle w:val="Hyperlink"/>
+          </w:rPr>
+          <w:t>r</w:t>
+        </w:r>
+        <w:r>
+          <w:rPr>
+            <w:rStyle w:val="Hyperlink"/>
+          </w:rPr>
+          <w:t>yrealty.com/</w:t>
+        </w:r>
+      </w:hyperlink>
+    </w:p>
+    <w:p>
+      <w:pPr>
         <w:ind w:firstLine="0"/>
-        <w:rPr>
-          <w:b/>
-          <w:bCs/>
-          <w:spacing w:val="-2"/>
-        </w:rPr>
-      </w:pPr>
-      <w:r>
+      </w:pPr>
+      <w:r>
+        <w:drawing>
+          <wp:inline distT="0" distB="0" distL="0" distR="0" wp14:anchorId="03E3D7E1" wp14:editId="45F29090">
+            <wp:extent cx="5192973" cy="2812860"/>
+            <wp:effectExtent l="0" t="0" r="8255" b="6985"/>
+            <wp:docPr id="1960512547" name="Picture 1" descr="A screenshot of a map&#10;&#10;Description automatically generated"/>
+            <wp:cNvGraphicFramePr>
+              <a:graphicFrameLocks xmlns:a="http://schemas.openxmlformats.org/drawingml/2006/main" noChangeAspect="1"/>
+            </wp:cNvGraphicFramePr>
+            <a:graphic xmlns:a="http://schemas.openxmlformats.org/drawingml/2006/main">
+              <a:graphicData uri="http://schemas.openxmlformats.org/drawingml/2006/picture">
+                <pic:pic xmlns:pic="http://schemas.openxmlformats.org/drawingml/2006/picture">
+                  <pic:nvPicPr>
+                    <pic:cNvPr id="1960512547" name="Picture 1" descr="A screenshot of a map&#10;&#10;Description automatically generated"/>
+                    <pic:cNvPicPr/>
+                  </pic:nvPicPr>
+                  <pic:blipFill>
+                    <a:blip r:embed="rId7"/>
+                    <a:stretch>
+                      <a:fillRect/>
+                    </a:stretch>
+                  </pic:blipFill>
+                  <pic:spPr>
+                    <a:xfrm>
+                      <a:off x="0" y="0"/>
+                      <a:ext cx="5206160" cy="2820003"/>
+                    </a:xfrm>
+                    <a:prstGeom prst="rect">
+                      <a:avLst/>
+                    </a:prstGeom>
+                  </pic:spPr>
+                </pic:pic>
+              </a:graphicData>
+            </a:graphic>
+          </wp:inline>
+        </w:drawing>
+      </w:r>
+    </w:p>
+    <w:p>
+      <w:pPr>
+        <w:ind w:firstLine="0"/>
+        <w:rPr>
+          <w:b/>
+          <w:bCs/>
+        </w:rPr>
+      </w:pPr>
+      <w:r>
+        <w:rPr>
+          <w:b/>
+          <w:bCs/>
+        </w:rPr>
+        <w:drawing>
+          <wp:inline distT="0" distB="0" distL="0" distR="0" wp14:anchorId="5121896D" wp14:editId="7B209341">
+            <wp:extent cx="5195727" cy="2804615"/>
+            <wp:effectExtent l="0" t="0" r="5080" b="0"/>
+            <wp:docPr id="1409972871" name="Picture 1" descr="A screenshot of a computer&#10;&#10;Description automatically generated"/>
+            <wp:cNvGraphicFramePr>
+              <a:graphicFrameLocks xmlns:a="http://schemas.openxmlformats.org/drawingml/2006/main" noChangeAspect="1"/>
+            </wp:cNvGraphicFramePr>
+            <a:graphic xmlns:a="http://schemas.openxmlformats.org/drawingml/2006/main">
+              <a:graphicData uri="http://schemas.openxmlformats.org/drawingml/2006/picture">
+                <pic:pic xmlns:pic="http://schemas.openxmlformats.org/drawingml/2006/picture">
+                  <pic:nvPicPr>
+                    <pic:cNvPr id="1409972871" name="Picture 1" descr="A screenshot of a computer&#10;&#10;Description automatically generated"/>
+                    <pic:cNvPicPr/>
+                  </pic:nvPicPr>
+                  <pic:blipFill>
+                    <a:blip r:embed="rId8"/>
+                    <a:stretch>
+                      <a:fillRect/>
+                    </a:stretch>
+                  </pic:blipFill>
+                  <pic:spPr>
+                    <a:xfrm>
+                      <a:off x="0" y="0"/>
+                      <a:ext cx="5222855" cy="2819258"/>
+                    </a:xfrm>
+                    <a:prstGeom prst="rect">
+                      <a:avLst/>
+                    </a:prstGeom>
+                  </pic:spPr>
+                </pic:pic>
+              </a:graphicData>
+            </a:graphic>
+          </wp:inline>
+        </w:drawing>
+      </w:r>
+    </w:p>
+    <w:p>
+      <w:r>
+        <w:t xml:space="preserve">Trang web của </w:t>
+      </w:r>
+      <w:r>
+        <w:t>Toan Huy Hoang</w:t>
+      </w:r>
+      <w:r>
+        <w:t xml:space="preserve">: </w:t>
+      </w:r>
+      <w:hyperlink r:id="rId9" w:history="1">
+        <w:r>
+          <w:rPr>
+            <w:rStyle w:val="Hyperlink"/>
+          </w:rPr>
+          <w:t>https://toanhuyho</w:t>
+        </w:r>
+        <w:r>
+          <w:rPr>
+            <w:rStyle w:val="Hyperlink"/>
+          </w:rPr>
+          <w:t>a</w:t>
+        </w:r>
+        <w:r>
+          <w:rPr>
+            <w:rStyle w:val="Hyperlink"/>
+          </w:rPr>
+          <w:t>ng.com/</w:t>
+        </w:r>
+      </w:hyperlink>
+    </w:p>
+    <w:p>
+      <w:pPr>
+        <w:ind w:firstLine="0"/>
+      </w:pPr>
+      <w:r>
+        <w:drawing>
+          <wp:inline distT="0" distB="0" distL="0" distR="0" wp14:anchorId="27868F89" wp14:editId="31C34E8E">
+            <wp:extent cx="5760720" cy="3084830"/>
+            <wp:effectExtent l="0" t="0" r="0" b="1270"/>
+            <wp:docPr id="1474161892" name="Picture 1" descr="A screenshot of a computer&#10;&#10;Description automatically generated"/>
+            <wp:cNvGraphicFramePr>
+              <a:graphicFrameLocks xmlns:a="http://schemas.openxmlformats.org/drawingml/2006/main" noChangeAspect="1"/>
+            </wp:cNvGraphicFramePr>
+            <a:graphic xmlns:a="http://schemas.openxmlformats.org/drawingml/2006/main">
+              <a:graphicData uri="http://schemas.openxmlformats.org/drawingml/2006/picture">
+                <pic:pic xmlns:pic="http://schemas.openxmlformats.org/drawingml/2006/picture">
+                  <pic:nvPicPr>
+                    <pic:cNvPr id="1474161892" name="Picture 1" descr="A screenshot of a computer&#10;&#10;Description automatically generated"/>
+                    <pic:cNvPicPr/>
+                  </pic:nvPicPr>
+                  <pic:blipFill>
+                    <a:blip r:embed="rId10"/>
+                    <a:stretch>
+                      <a:fillRect/>
+                    </a:stretch>
+                  </pic:blipFill>
+                  <pic:spPr>
+                    <a:xfrm>
+                      <a:off x="0" y="0"/>
+                      <a:ext cx="5760720" cy="3084830"/>
+                    </a:xfrm>
+                    <a:prstGeom prst="rect">
+                      <a:avLst/>
+                    </a:prstGeom>
+                  </pic:spPr>
+                </pic:pic>
+              </a:graphicData>
+            </a:graphic>
+          </wp:inline>
+        </w:drawing>
+      </w:r>
+    </w:p>
+    <w:p>
+      <w:pPr>
+        <w:pStyle w:val="P1"/>
+      </w:pPr>
+      <w:r>
+        <w:t>II</w:t>
+      </w:r>
+      <w:r>
+        <w:t>. Đặc tả yêu cầu chức năng hệ thống</w:t>
+      </w:r>
+    </w:p>
+    <w:p>
+      <w:r>
+        <w:t>Hệ thống được thiết kế nhằm phục vụ ba nhóm đối tượng chính: Khách tìm nhà, Chủ nhà (Host) và Quản trị viên (Admin), với các luồng nghiệp vụ được chuẩn hóa như sau:</w:t>
+      </w:r>
+    </w:p>
+    <w:p>
+      <w:r>
+        <w:t>Đối với Khách (Guest): Hệ thống cung cấp hai luồng tìm kiếm song song. Bên cạnh bộ lọc cơ bản (giá, loại phòng, khu vực,… ), điểm nhấn cốt lõi là công cụ tìm kiếm thông minh bằng AI. Người dùng chỉ cần nhập yêu cầu dưới dạng văn bản tự nhiên (ví dụ: "Tìm chung cư 2 phòng ngủ 10 triệu, cho nuôi chó"), hệ thống sẽ tự động bóc tách tham số và trả về kết quả sát nghĩa nhất.</w:t>
+      </w:r>
+    </w:p>
+    <w:p>
+      <w:r>
+        <w:t>Đối với Chủ nhà (Host): Khách vãng lai có thể đăng ký để trở thành Chủ nhà và phải qua bước xét duyệt. Khi được cấp quyền, Host sở hữu một bảng điều khiển (Dashboard) toàn diện để thực hiện các thao tác thêm, sửa, xóa, và ẩn tin đăng. Mọi bài đăng mới hoặc có sự thay đổi quan trọng đều tự động chuyển sang trạng thái chờ duyệt (PENDING) và chỉ xuất hiện khi có sự cho phép của nền tảng.</w:t>
+      </w:r>
+    </w:p>
+    <w:p>
+      <w:r>
+        <w:t>Đối với Quản trị viên (Admin): Đóng vai trò kiểm soát chất lượng dữ liệu cuối cùng. Admin thực hiện duyệt bài theo cơ chế hàng đợi (FIFO). Đối với các bài đăng vi phạm, Admin có quyền từ chối kèm theo lý do bắt buộc để Host chỉnh sửa. Đồng thời, Admin nắm quyền cao nhất trong việc khóa vĩnh viễn (Ban) các đối tác gian lận, đi kèm với trigger tự động ẩn toàn bộ bài đăng liên quan để bảo vệ người dùng.</w:t>
+      </w:r>
+    </w:p>
+    <w:p>
+      <w:pPr>
+        <w:pStyle w:val="P1"/>
+      </w:pPr>
+      <w:r>
+        <w:t>III</w:t>
+      </w:r>
+      <w:r>
+        <w:t xml:space="preserve">. Đề xuất cải tiến và </w:t>
+      </w:r>
+      <w:r>
+        <w:t>g</w:t>
+      </w:r>
+      <w:r>
+        <w:t>iải pháp công nghệ</w:t>
+      </w:r>
+    </w:p>
+    <w:p>
+      <w:r>
+        <w:t xml:space="preserve">Nhằm tạo ra sự đột phá so với các nền tảng truyền thống, hệ thống tập trung mạnh vào việc nâng cấp </w:t>
+      </w:r>
+      <w:r>
+        <w:t>t</w:t>
+      </w:r>
+      <w:r>
+        <w:t xml:space="preserve">rải nghiệm tìm kiếm (Search Experience). Thay vì bắt người dùng điền tay hàng loạt dropdown, hệ thống tích hợp giải pháp </w:t>
+      </w:r>
+      <w:r>
+        <w:t>AI NLP (Xử lý ngôn ngữ tự nhiên)</w:t>
+      </w:r>
+      <w:r>
+        <w:t>. Giải pháp này biến bộ máy tìm kiếm thành một trợ lý ảo thực thụ, hiểu được ngữ nghĩa biểu đạt của khách hàng để gọi ra các dữ liệu phù hợp nhất, giảm thiểu tối đa thời gian tìm phòng của người dùng.</w:t>
+      </w:r>
+    </w:p>
+    <w:p/>
+    <w:p>
+      <w:pPr>
+        <w:ind w:firstLine="0"/>
         <w:rPr>
           <w:b/>
           <w:bCs/>
           <w:noProof/>
           <w:spacing w:val="-2"/>
         </w:rPr>
-        <w:lastRenderedPageBreak/>
+      </w:pPr>
+      <w:r>
+        <w:rPr>
+          <w:b/>
+          <w:bCs/>
+          <w:noProof/>
+          <w:spacing w:val="-2"/>
+        </w:rPr>
+        <w:tab/>
+      </w:r>
+    </w:p>
+    <w:p>
+      <w:pPr>
+        <w:ind w:firstLine="0"/>
+        <w:rPr>
+          <w:b/>
+          <w:bCs/>
+          <w:spacing w:val="-2"/>
+        </w:rPr>
+      </w:pPr>
+      <w:r>
+        <w:rPr>
+          <w:b/>
+          <w:bCs/>
+          <w:noProof/>
+          <w:spacing w:val="-2"/>
+        </w:rPr>
         <w:drawing>
           <wp:inline distT="0" distB="0" distL="0" distR="0" wp14:anchorId="44C148F2" wp14:editId="224D157B">
             <wp:extent cx="5748655" cy="6766560"/>
@@ -854,7 +1179,7 @@
                     </pic:cNvPicPr>
                   </pic:nvPicPr>
                   <pic:blipFill>
-                    <a:blip r:embed="rId6">
+                    <a:blip r:embed="rId11">
                       <a:extLst>
                         <a:ext uri="{28A0092B-C50C-407E-A947-70E740481C1C}">
                           <a14:useLocalDpi xmlns:a14="http://schemas.microsoft.com/office/drawing/2010/main" val="0"/>
@@ -1384,6 +1709,7 @@
   <w:style w:type="character" w:default="1" w:styleId="DefaultParagraphFont">
     <w:name w:val="Default Paragraph Font"/>
     <w:uiPriority w:val="1"/>
+    <w:semiHidden/>
     <w:unhideWhenUsed/>
   </w:style>
   <w:style w:type="table" w:default="1" w:styleId="TableNormal">
@@ -1416,7 +1742,6 @@
     <w:rsid w:val="00AF21A4"/>
     <w:pPr>
       <w:spacing w:after="120"/>
-      <w:jc w:val="both"/>
       <w:outlineLvl w:val="1"/>
     </w:pPr>
     <w:rPr>
@@ -1436,6 +1761,7 @@
       <w:color w:val="000000" w:themeColor="text1"/>
       <w:sz w:val="28"/>
       <w:szCs w:val="26"/>
+      <w:lang w:eastAsia="en-US"/>
     </w:rPr>
   </w:style>
   <w:style w:type="character" w:customStyle="1" w:styleId="Heading1Char">
@@ -1641,9 +1967,8 @@
     <w:link w:val="P1Char"/>
     <w:autoRedefine/>
     <w:qFormat/>
-    <w:rsid w:val="00FF4096"/>
+    <w:rsid w:val="00B36C86"/>
     <w:pPr>
-      <w:jc w:val="center"/>
       <w:outlineLvl w:val="0"/>
     </w:pPr>
     <w:rPr>
@@ -1656,13 +1981,13 @@
     <w:name w:val="P1 Char"/>
     <w:basedOn w:val="DefaultParagraphFont"/>
     <w:link w:val="P1"/>
-    <w:rsid w:val="00FF4096"/>
+    <w:rsid w:val="00B36C86"/>
     <w:rPr>
-      <w:rFonts w:ascii="Times New Roman" w:hAnsi="Times New Roman"/>
+      <w:rFonts w:ascii="Times New Roman" w:eastAsia="Times New Roman" w:hAnsi="Times New Roman" w:cs="Times New Roman"/>
       <w:b/>
       <w:color w:val="000000" w:themeColor="text1"/>
       <w:sz w:val="28"/>
-      <w:szCs w:val="26"/>
+      <w:lang w:eastAsia="en-US"/>
     </w:rPr>
   </w:style>
   <w:style w:type="paragraph" w:styleId="BodyText">
@@ -1756,6 +2081,41 @@
         <w:insideV w:val="single" w:sz="4" w:space="0" w:color="auto"/>
       </w:tblBorders>
     </w:tblPr>
+  </w:style>
+  <w:style w:type="character" w:styleId="Hyperlink">
+    <w:name w:val="Hyperlink"/>
+    <w:basedOn w:val="DefaultParagraphFont"/>
+    <w:uiPriority w:val="99"/>
+    <w:unhideWhenUsed/>
+    <w:rsid w:val="00E63E96"/>
+    <w:rPr>
+      <w:color w:val="0563C1" w:themeColor="hyperlink"/>
+      <w:u w:val="single"/>
+    </w:rPr>
+  </w:style>
+  <w:style w:type="character" w:styleId="UnresolvedMention">
+    <w:name w:val="Unresolved Mention"/>
+    <w:basedOn w:val="DefaultParagraphFont"/>
+    <w:uiPriority w:val="99"/>
+    <w:semiHidden/>
+    <w:unhideWhenUsed/>
+    <w:rsid w:val="00E63E96"/>
+    <w:rPr>
+      <w:color w:val="605E5C"/>
+      <w:shd w:val="clear" w:color="auto" w:fill="E1DFDD"/>
+    </w:rPr>
+  </w:style>
+  <w:style w:type="character" w:styleId="FollowedHyperlink">
+    <w:name w:val="FollowedHyperlink"/>
+    <w:basedOn w:val="DefaultParagraphFont"/>
+    <w:uiPriority w:val="99"/>
+    <w:semiHidden/>
+    <w:unhideWhenUsed/>
+    <w:rsid w:val="00E63E96"/>
+    <w:rPr>
+      <w:color w:val="954F72" w:themeColor="followedHyperlink"/>
+      <w:u w:val="single"/>
+    </w:rPr>
   </w:style>
 </w:styles>
 </file>

</xml_diff>

<commit_message>
Hoàn thiện diagram cho UC07
</commit_message>
<xml_diff>
--- a/src/main/resources/docs/Nhom10_23110110_23110078_ChoThueBatDongSan.docx
+++ b/src/main/resources/docs/Nhom10_23110110_23110078_ChoThueBatDongSan.docx
@@ -1077,7 +1077,15 @@
     </w:p>
     <w:p>
       <w:r>
-        <w:t>Đối với Khách (Guest): Hệ thống cung cấp hai luồng tìm kiếm song song. Bên cạnh bộ lọc cơ bản (giá, loại phòng, khu vực,… ), điểm nhấn cốt lõi là công cụ tìm kiếm thông minh bằng AI. Người dùng chỉ cần nhập yêu cầu dưới dạng văn bản tự nhiên (ví dụ: "Tìm chung cư 2 phòng ngủ 10 triệu, cho nuôi chó"), hệ thống sẽ tự động bóc tách tham số và trả về kết quả sát nghĩa nhất.</w:t>
+        <w:t xml:space="preserve">Đối với Khách (Guest): Hệ thống cung cấp hai luồng tìm kiếm song song. Bên cạnh bộ lọc cơ bản (giá, loại phòng, khu </w:t>
+      </w:r>
+      <w:proofErr w:type="gramStart"/>
+      <w:r>
+        <w:t>vực,…</w:t>
+      </w:r>
+      <w:proofErr w:type="gramEnd"/>
+      <w:r>
+        <w:t xml:space="preserve"> ), điểm nhấn cốt lõi là công cụ tìm kiếm thông minh bằng AI. Người dùng chỉ cần nhập yêu cầu dưới dạng văn bản tự nhiên (ví dụ: "Tìm chung cư 2 phòng ngủ 10 triệu, cho nuôi chó"), hệ thống sẽ tự động bóc tách tham số và trả về kết quả sát nghĩa nhất.</w:t>
       </w:r>
     </w:p>
     <w:p>
@@ -1122,6 +1130,75 @@
       </w:r>
       <w:r>
         <w:t>. Giải pháp này biến bộ máy tìm kiếm thành một trợ lý ảo thực thụ, hiểu được ngữ nghĩa biểu đạt của khách hàng để gọi ra các dữ liệu phù hợp nhất, giảm thiểu tối đa thời gian tìm phòng của người dùng.</w:t>
+      </w:r>
+    </w:p>
+    <w:p>
+      <w:pPr>
+        <w:ind w:firstLine="0"/>
+      </w:pPr>
+      <w:r>
+        <w:rPr>
+          <w:noProof/>
+        </w:rPr>
+        <w:drawing>
+          <wp:inline distT="0" distB="0" distL="0" distR="0" wp14:anchorId="5498D429" wp14:editId="7BF5C72D">
+            <wp:extent cx="5759450" cy="3957955"/>
+            <wp:effectExtent l="0" t="0" r="0" b="4445"/>
+            <wp:docPr id="1409170576" name="Picture 2"/>
+            <wp:cNvGraphicFramePr>
+              <a:graphicFrameLocks xmlns:a="http://schemas.openxmlformats.org/drawingml/2006/main" noChangeAspect="1"/>
+            </wp:cNvGraphicFramePr>
+            <a:graphic xmlns:a="http://schemas.openxmlformats.org/drawingml/2006/main">
+              <a:graphicData uri="http://schemas.openxmlformats.org/drawingml/2006/picture">
+                <pic:pic xmlns:pic="http://schemas.openxmlformats.org/drawingml/2006/picture">
+                  <pic:nvPicPr>
+                    <pic:cNvPr id="0" name="Picture 2"/>
+                    <pic:cNvPicPr>
+                      <a:picLocks noChangeAspect="1" noChangeArrowheads="1"/>
+                    </pic:cNvPicPr>
+                  </pic:nvPicPr>
+                  <pic:blipFill>
+                    <a:blip r:embed="rId11">
+                      <a:extLst>
+                        <a:ext uri="{28A0092B-C50C-407E-A947-70E740481C1C}">
+                          <a14:useLocalDpi xmlns:a14="http://schemas.microsoft.com/office/drawing/2010/main" val="0"/>
+                        </a:ext>
+                      </a:extLst>
+                    </a:blip>
+                    <a:srcRect/>
+                    <a:stretch>
+                      <a:fillRect/>
+                    </a:stretch>
+                  </pic:blipFill>
+                  <pic:spPr bwMode="auto">
+                    <a:xfrm>
+                      <a:off x="0" y="0"/>
+                      <a:ext cx="5759450" cy="3957955"/>
+                    </a:xfrm>
+                    <a:prstGeom prst="rect">
+                      <a:avLst/>
+                    </a:prstGeom>
+                    <a:noFill/>
+                    <a:ln>
+                      <a:noFill/>
+                    </a:ln>
+                  </pic:spPr>
+                </pic:pic>
+              </a:graphicData>
+            </a:graphic>
+          </wp:inline>
+        </w:drawing>
+      </w:r>
+    </w:p>
+    <w:p>
+      <w:pPr>
+        <w:ind w:firstLine="0"/>
+      </w:pPr>
+      <w:r>
+        <w:br/>
+      </w:r>
+      <w:r>
+        <w:tab/>
       </w:r>
     </w:p>
     <w:p/>
@@ -1179,7 +1256,7 @@
                     </pic:cNvPicPr>
                   </pic:nvPicPr>
                   <pic:blipFill>
-                    <a:blip r:embed="rId11">
+                    <a:blip r:embed="rId12">
                       <a:extLst>
                         <a:ext uri="{28A0092B-C50C-407E-A947-70E740481C1C}">
                           <a14:useLocalDpi xmlns:a14="http://schemas.microsoft.com/office/drawing/2010/main" val="0"/>

</xml_diff>